<commit_message>
error in in-text numerating. Big step
</commit_message>
<xml_diff>
--- a/TestFile_3.docx
+++ b/TestFile_3.docx
@@ -6,32 +6,14 @@
       <w:r>
         <w:t>Здесь тестовый текст…</w:t>
       </w:r>
-    </w:p>
-    <w:p/>
-    <w:p>
-      <w:r>
-        <w:t xml:space="preserve">Рисунок </w:t>
-      </w:r>
-      <w:r>
-        <w:t>{}</w:t>
-      </w:r>
-      <w:r>
-        <w:t xml:space="preserve"> – тестовый рисунок 1</w:t>
-      </w:r>
-    </w:p>
-    <w:p/>
-    <w:p>
-      <w:r>
-        <w:t>Здесь тестовый текст снова…</w:t>
-      </w:r>
       <w:r>
         <w:t xml:space="preserve"> </w:t>
       </w:r>
       <w:r>
-        <w:t xml:space="preserve">Проверяем нумерацию на рисунке </w:t>
-      </w:r>
-      <w:r>
-        <w:t>{</w:t>
+        <w:t>Проверка первого пограничного случая. Рисунок</w:t>
+      </w:r>
+      <w:r>
+        <w:t xml:space="preserve"> {</w:t>
       </w:r>
       <w:r>
         <w:rPr>
@@ -40,6 +22,60 @@
         <w:t>P</w:t>
       </w:r>
       <w:r>
+        <w:t>}</w:t>
+      </w:r>
+      <w:r>
+        <w:t xml:space="preserve"> не должен здесь существовать</w:t>
+      </w:r>
+      <w:r>
+        <w:t>.</w:t>
+      </w:r>
+      <w:r>
+        <w:t xml:space="preserve"> Рисунки </w:t>
+      </w:r>
+      <w:r>
+        <w:rPr>
+          <w:lang w:val="en-US"/>
+        </w:rPr>
+        <w:t xml:space="preserve">{}, {}, {} </w:t>
+      </w:r>
+      <w:r>
+        <w:t>появятся здесь.</w:t>
+      </w:r>
+    </w:p>
+    <w:p/>
+    <w:p>
+      <w:r>
+        <w:t xml:space="preserve">Рисунок </w:t>
+      </w:r>
+      <w:r>
+        <w:t>{}</w:t>
+      </w:r>
+      <w:r>
+        <w:t xml:space="preserve"> – тестовый рисунок 1</w:t>
+      </w:r>
+    </w:p>
+    <w:p/>
+    <w:p>
+      <w:r>
+        <w:t>Здесь тестовый текст снова…</w:t>
+      </w:r>
+      <w:r>
+        <w:t xml:space="preserve"> </w:t>
+      </w:r>
+      <w:r>
+        <w:t xml:space="preserve">Проверяем нумерацию на рисунке </w:t>
+      </w:r>
+      <w:r>
+        <w:t>{</w:t>
+      </w:r>
+      <w:r>
+        <w:rPr>
+          <w:lang w:val="en-US"/>
+        </w:rPr>
+        <w:t>P</w:t>
+      </w:r>
+      <w:r>
         <w:t>}.</w:t>
       </w:r>
     </w:p>
@@ -200,6 +236,32 @@
       </w:r>
       <w:r>
         <w:t xml:space="preserve"> + 2}.</w:t>
+      </w:r>
+      <w:r>
+        <w:t xml:space="preserve"> </w:t>
+      </w:r>
+    </w:p>
+    <w:p>
+      <w:r>
+        <w:t xml:space="preserve">Проверка пограничных случаев. Следующего рисунка под номером </w:t>
+      </w:r>
+      <w:r>
+        <w:t>{</w:t>
+      </w:r>
+      <w:r>
+        <w:rPr>
+          <w:lang w:val="en-US"/>
+        </w:rPr>
+        <w:t>N</w:t>
+      </w:r>
+      <w:r>
+        <w:t xml:space="preserve">} </w:t>
+      </w:r>
+      <w:r>
+        <w:t>должно не быть</w:t>
+      </w:r>
+      <w:r>
+        <w:t>.</w:t>
       </w:r>
     </w:p>
     <w:sectPr>

</xml_diff>